<commit_message>
fix: agendamento em criação
</commit_message>
<xml_diff>
--- a/Engenharia_ERS.docx
+++ b/Engenharia_ERS.docx
@@ -12,7 +12,7 @@
           <w:sz w:val="20"/>
         </w:rPr>
         <w:drawing>
-          <wp:anchor distT="0" distB="0" distL="114300" distR="114300" simplePos="0" relativeHeight="251659264" behindDoc="1" locked="0" layoutInCell="1" allowOverlap="1" wp14:anchorId="0C71D415" wp14:editId="7F6310C9">
+          <wp:anchor distT="0" distB="0" distL="114300" distR="114300" simplePos="0" relativeHeight="251659264" behindDoc="1" locked="0" layoutInCell="1" allowOverlap="1" wp14:anchorId="0C71D415" wp14:editId="54FA38F2">
             <wp:simplePos x="0" y="0"/>
             <wp:positionH relativeFrom="column">
               <wp:posOffset>-1085850</wp:posOffset>
@@ -32315,7 +32315,7 @@
         </w:rPr>
         <w:lastRenderedPageBreak/>
         <w:drawing>
-          <wp:inline distT="0" distB="0" distL="0" distR="0" wp14:anchorId="1F702B80" wp14:editId="138C1089">
+          <wp:inline distT="0" distB="0" distL="0" distR="0" wp14:anchorId="1F702B80" wp14:editId="3416424C">
             <wp:extent cx="8217996" cy="5776595"/>
             <wp:effectExtent l="1270" t="0" r="0" b="0"/>
             <wp:docPr id="1525075956" name="Imagem 5"/>
@@ -32695,7 +32695,7 @@
               </wp:inline>
             </w:drawing>
           </mc:Choice>
-          <mc:Fallback xmlns:a="http://schemas.openxmlformats.org/drawingml/2006/main" xmlns:pic="http://schemas.openxmlformats.org/drawingml/2006/picture" xmlns:a14="http://schemas.microsoft.com/office/drawing/2010/main" xmlns:asvg="http://schemas.microsoft.com/office/drawing/2016/SVG/main">
+          <mc:Fallback xmlns:asvg="http://schemas.microsoft.com/office/drawing/2016/SVG/main" xmlns:a14="http://schemas.microsoft.com/office/drawing/2010/main" xmlns:pic="http://schemas.openxmlformats.org/drawingml/2006/picture" xmlns:a="http://schemas.openxmlformats.org/drawingml/2006/main">
             <w:pict w14:anchorId="4724BB1F">
               <v:group id="Group 10" style="width:428.25pt;height:.5pt;mso-position-horizontal-relative:char;mso-position-vertical-relative:line" coordsize="54387,63" o:spid="_x0000_s1026" w14:anchorId="46244FA7" o:gfxdata="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">
                 <v:shape id="Graphic 11" style="position:absolute;width:54387;height:63;visibility:visible;mso-wrap-style:square;v-text-anchor:top" coordsize="5438775,6350" o:spid="_x0000_s1027" fillcolor="black" stroked="f" path="m5438521,l,,,6096r5438521,l5438521,xe" o:gfxdata="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">

</xml_diff>